<commit_message>
Add project report and Medium-ready blog
</commit_message>
<xml_diff>
--- a/documentation/SonicSentinel AI - Technical Blog Updated.docx
+++ b/documentation/SonicSentinel AI - Technical Blog Updated.docx
@@ -424,12 +424,12 @@
     </w:p>
     <w:p>
       <w:r>
-        <w:t>On 28 September 2026, all 31 automated tests passed. Coverage included training checks, upload and reporting flows, access restrictions and alert logic. Real-model route checks processed recordings from all ten classes. One aggression sample was predicted as panic scream, showing that the successful completion of a request does not necessarily mean the classification was correct.</w:t>
+        <w:t>On 29 September 2026, the regression suite completed with 38 tests passing. Coverage included training checks, upload and reporting flows, access restrictions and alert logic. Real-model route checks processed recordings from all ten classes. One aggression sample was predicted as panic scream, showing that the successful completion of a request does not necessarily mean the classification was correct.</w:t>
       </w:r>
     </w:p>
     <w:p>
       <w:r>
-        <w:t>Warm processing took 0.906 seconds for a 30-second upload and 0.107 seconds for a three-second live request on the tested host. Both are within the SRS limits of eight and three seconds respectively. The first cold inference in the verification script took 16.166 seconds, so normal application startup warms the Python model before accepting requests. Hardware and deployment configuration can change these timings.</w:t>
+        <w:t>On the tested host, a warm 30-second upload took 2.814 seconds and a warm three-second live request took 0.282 seconds. Both were within the SRS limits of eight and three seconds respectively. The application warmed both models in 26.950 seconds before accepting requests. These local measurements do not guarantee the same performance on different hardware or under concurrent load.</w:t>
       </w:r>
     </w:p>
     <w:p>

</xml_diff>